<commit_message>
chore: perbarui file TEMPLATE JURNAL PERMINGGU.docx
</commit_message>
<xml_diff>
--- a/public/template/TEMPLATE JURNAL PERMINGGU.docx
+++ b/public/template/TEMPLATE JURNAL PERMINGGU.docx
@@ -151,7 +151,6 @@
         </w:rPr>
       </w:pPr>
       <w:proofErr w:type="spellStart"/>
-      <w:proofErr w:type="gramStart"/>
       <w:r>
         <w:rPr>
           <w:rFonts w:ascii="Times New Roman" w:hAnsi="Times New Roman" w:cs="Times New Roman"/>
@@ -169,17 +168,7 @@
           <w:szCs w:val="24"/>
           <w:lang w:val="en-ID"/>
         </w:rPr>
-        <w:t xml:space="preserve"> :</w:t>
-      </w:r>
-      <w:proofErr w:type="gramEnd"/>
-      <w:r>
-        <w:rPr>
-          <w:rFonts w:ascii="Times New Roman" w:hAnsi="Times New Roman" w:cs="Times New Roman"/>
-          <w:sz w:val="24"/>
-          <w:szCs w:val="24"/>
-          <w:lang w:val="en-ID"/>
-        </w:rPr>
-        <w:t xml:space="preserve"> </w:t>
+        <w:t xml:space="preserve"> : </w:t>
       </w:r>
       <w:r>
         <w:rPr>
@@ -237,7 +226,6 @@
         <w:t xml:space="preserve"> </w:t>
       </w:r>
       <w:proofErr w:type="spellStart"/>
-      <w:proofErr w:type="gramStart"/>
       <w:r>
         <w:rPr>
           <w:rFonts w:ascii="Times New Roman" w:hAnsi="Times New Roman" w:cs="Times New Roman"/>
@@ -257,7 +245,6 @@
         </w:rPr>
         <w:t xml:space="preserve"> :</w:t>
       </w:r>
-      <w:proofErr w:type="gramEnd"/>
       <w:r>
         <w:rPr>
           <w:rFonts w:ascii="Times New Roman" w:hAnsi="Times New Roman" w:cs="Times New Roman"/>
@@ -774,7 +761,6 @@
         <w:t xml:space="preserve">Kata </w:t>
       </w:r>
       <w:proofErr w:type="spellStart"/>
-      <w:proofErr w:type="gramStart"/>
       <w:r>
         <w:rPr>
           <w:rFonts w:ascii="Times New Roman" w:hAnsi="Times New Roman" w:cs="Times New Roman"/>
@@ -790,16 +776,7 @@
           <w:sz w:val="24"/>
           <w:szCs w:val="24"/>
         </w:rPr>
-        <w:t xml:space="preserve"> :</w:t>
-      </w:r>
-      <w:proofErr w:type="gramEnd"/>
-      <w:r>
-        <w:rPr>
-          <w:rFonts w:ascii="Times New Roman" w:hAnsi="Times New Roman" w:cs="Times New Roman"/>
-          <w:sz w:val="24"/>
-          <w:szCs w:val="24"/>
-        </w:rPr>
-        <w:t xml:space="preserve"> variable speed control, rectifier, SCADA</w:t>
+        <w:t xml:space="preserve"> : variable speed control, rectifier, SCADA</w:t>
       </w:r>
     </w:p>
     <w:p>
@@ -4890,7 +4867,7 @@
           <w:szCs w:val="24"/>
         </w:rPr>
         <w:drawing>
-          <wp:anchor distT="0" distB="0" distL="114300" distR="114300" simplePos="0" relativeHeight="251659264" behindDoc="1" locked="0" layoutInCell="1" allowOverlap="1" wp14:anchorId="07B9D987" wp14:editId="19BD45AE">
+          <wp:anchor distT="0" distB="0" distL="114300" distR="114300" simplePos="0" relativeHeight="251659264" behindDoc="1" locked="0" layoutInCell="1" allowOverlap="1" wp14:anchorId="07B9D987" wp14:editId="0B352308">
             <wp:simplePos x="0" y="0"/>
             <wp:positionH relativeFrom="column">
               <wp:posOffset>299085</wp:posOffset>
@@ -6300,7 +6277,6 @@
         <w:t xml:space="preserve"> </w:t>
       </w:r>
       <w:proofErr w:type="spellStart"/>
-      <w:proofErr w:type="gramStart"/>
       <w:r>
         <w:rPr>
           <w:rFonts w:ascii="Times New Roman" w:hAnsi="Times New Roman" w:cs="Times New Roman"/>
@@ -6318,7 +6294,6 @@
         </w:rPr>
         <w:t xml:space="preserve"> :</w:t>
       </w:r>
-      <w:proofErr w:type="gramEnd"/>
     </w:p>
     <w:p>
       <w:pPr>
@@ -6928,701 +6903,6 @@
           <w:sz w:val="24"/>
           <w:szCs w:val="24"/>
         </w:rPr>
-        <w:t xml:space="preserve">Teori </w:t>
-      </w:r>
-      <w:proofErr w:type="spellStart"/>
-      <w:r>
-        <w:rPr>
-          <w:b/>
-          <w:bCs/>
-          <w:sz w:val="24"/>
-          <w:szCs w:val="24"/>
-        </w:rPr>
-        <w:t>Penerapan</w:t>
-      </w:r>
-      <w:proofErr w:type="spellEnd"/>
-    </w:p>
-    <w:p>
-      <w:pPr>
-        <w:tabs>
-          <w:tab w:val="left" w:pos="1298"/>
-        </w:tabs>
-        <w:spacing w:after="240" w:line="360" w:lineRule="auto"/>
-        <w:jc w:val="both"/>
-        <w:rPr>
-          <w:rFonts w:ascii="Times New Roman" w:hAnsi="Times New Roman" w:cs="Times New Roman"/>
-          <w:sz w:val="24"/>
-          <w:szCs w:val="24"/>
-        </w:rPr>
-      </w:pPr>
-      <w:r>
-        <w:rPr>
-          <w:rFonts w:ascii="Times New Roman" w:hAnsi="Times New Roman" w:cs="Times New Roman"/>
-          <w:sz w:val="24"/>
-          <w:szCs w:val="24"/>
-        </w:rPr>
-        <w:t xml:space="preserve">CX supervisor dan CX programmer yang </w:t>
-      </w:r>
-      <w:proofErr w:type="spellStart"/>
-      <w:r>
-        <w:rPr>
-          <w:rFonts w:ascii="Times New Roman" w:hAnsi="Times New Roman" w:cs="Times New Roman"/>
-          <w:sz w:val="24"/>
-          <w:szCs w:val="24"/>
-        </w:rPr>
-        <w:t>akan</w:t>
-      </w:r>
-      <w:proofErr w:type="spellEnd"/>
-      <w:r>
-        <w:rPr>
-          <w:rFonts w:ascii="Times New Roman" w:hAnsi="Times New Roman" w:cs="Times New Roman"/>
-          <w:sz w:val="24"/>
-          <w:szCs w:val="24"/>
-        </w:rPr>
-        <w:t xml:space="preserve"> </w:t>
-      </w:r>
-      <w:proofErr w:type="spellStart"/>
-      <w:r>
-        <w:rPr>
-          <w:rFonts w:ascii="Times New Roman" w:hAnsi="Times New Roman" w:cs="Times New Roman"/>
-          <w:sz w:val="24"/>
-          <w:szCs w:val="24"/>
-        </w:rPr>
-        <w:t>digunakan</w:t>
-      </w:r>
-      <w:proofErr w:type="spellEnd"/>
-      <w:r>
-        <w:rPr>
-          <w:rFonts w:ascii="Times New Roman" w:hAnsi="Times New Roman" w:cs="Times New Roman"/>
-          <w:sz w:val="24"/>
-          <w:szCs w:val="24"/>
-        </w:rPr>
-        <w:t xml:space="preserve"> </w:t>
-      </w:r>
-      <w:proofErr w:type="spellStart"/>
-      <w:r>
-        <w:rPr>
-          <w:rFonts w:ascii="Times New Roman" w:hAnsi="Times New Roman" w:cs="Times New Roman"/>
-          <w:sz w:val="24"/>
-          <w:szCs w:val="24"/>
-        </w:rPr>
-        <w:t>untuk</w:t>
-      </w:r>
-      <w:proofErr w:type="spellEnd"/>
-      <w:r>
-        <w:rPr>
-          <w:rFonts w:ascii="Times New Roman" w:hAnsi="Times New Roman" w:cs="Times New Roman"/>
-          <w:sz w:val="24"/>
-          <w:szCs w:val="24"/>
-        </w:rPr>
-        <w:t xml:space="preserve"> </w:t>
-      </w:r>
-      <w:proofErr w:type="spellStart"/>
-      <w:r>
-        <w:rPr>
-          <w:rFonts w:ascii="Times New Roman" w:hAnsi="Times New Roman" w:cs="Times New Roman"/>
-          <w:sz w:val="24"/>
-          <w:szCs w:val="24"/>
-        </w:rPr>
-        <w:t>memprogram</w:t>
-      </w:r>
-      <w:proofErr w:type="spellEnd"/>
-      <w:r>
-        <w:rPr>
-          <w:rFonts w:ascii="Times New Roman" w:hAnsi="Times New Roman" w:cs="Times New Roman"/>
-          <w:sz w:val="24"/>
-          <w:szCs w:val="24"/>
-        </w:rPr>
-        <w:t xml:space="preserve"> dan </w:t>
-      </w:r>
-      <w:proofErr w:type="spellStart"/>
-      <w:r>
-        <w:rPr>
-          <w:rFonts w:ascii="Times New Roman" w:hAnsi="Times New Roman" w:cs="Times New Roman"/>
-          <w:sz w:val="24"/>
-          <w:szCs w:val="24"/>
-        </w:rPr>
-        <w:t>untuk</w:t>
-      </w:r>
-      <w:proofErr w:type="spellEnd"/>
-      <w:r>
-        <w:rPr>
-          <w:rFonts w:ascii="Times New Roman" w:hAnsi="Times New Roman" w:cs="Times New Roman"/>
-          <w:sz w:val="24"/>
-          <w:szCs w:val="24"/>
-        </w:rPr>
-        <w:t xml:space="preserve"> </w:t>
-      </w:r>
-      <w:proofErr w:type="spellStart"/>
-      <w:r>
-        <w:rPr>
-          <w:rFonts w:ascii="Times New Roman" w:hAnsi="Times New Roman" w:cs="Times New Roman"/>
-          <w:sz w:val="24"/>
-          <w:szCs w:val="24"/>
-        </w:rPr>
-        <w:t>mensimulasikan</w:t>
-      </w:r>
-      <w:proofErr w:type="spellEnd"/>
-      <w:r>
-        <w:rPr>
-          <w:rFonts w:ascii="Times New Roman" w:hAnsi="Times New Roman" w:cs="Times New Roman"/>
-          <w:sz w:val="24"/>
-          <w:szCs w:val="24"/>
-        </w:rPr>
-        <w:t xml:space="preserve"> </w:t>
-      </w:r>
-      <w:proofErr w:type="spellStart"/>
-      <w:r>
-        <w:rPr>
-          <w:rFonts w:ascii="Times New Roman" w:hAnsi="Times New Roman" w:cs="Times New Roman"/>
-          <w:sz w:val="24"/>
-          <w:szCs w:val="24"/>
-        </w:rPr>
-        <w:t>peralatan</w:t>
-      </w:r>
-      <w:proofErr w:type="spellEnd"/>
-      <w:r>
-        <w:rPr>
-          <w:rFonts w:ascii="Times New Roman" w:hAnsi="Times New Roman" w:cs="Times New Roman"/>
-          <w:sz w:val="24"/>
-          <w:szCs w:val="24"/>
-        </w:rPr>
-        <w:t xml:space="preserve">, </w:t>
-      </w:r>
-      <w:proofErr w:type="spellStart"/>
-      <w:r>
-        <w:rPr>
-          <w:rFonts w:ascii="Times New Roman" w:hAnsi="Times New Roman" w:cs="Times New Roman"/>
-          <w:sz w:val="24"/>
-          <w:szCs w:val="24"/>
-        </w:rPr>
-        <w:t>kemudian</w:t>
-      </w:r>
-      <w:proofErr w:type="spellEnd"/>
-      <w:r>
-        <w:rPr>
-          <w:rFonts w:ascii="Times New Roman" w:hAnsi="Times New Roman" w:cs="Times New Roman"/>
-          <w:sz w:val="24"/>
-          <w:szCs w:val="24"/>
-        </w:rPr>
-        <w:t xml:space="preserve"> </w:t>
-      </w:r>
-      <w:proofErr w:type="spellStart"/>
-      <w:r>
-        <w:rPr>
-          <w:rFonts w:ascii="Times New Roman" w:hAnsi="Times New Roman" w:cs="Times New Roman"/>
-          <w:sz w:val="24"/>
-          <w:szCs w:val="24"/>
-        </w:rPr>
-        <w:t>kita</w:t>
-      </w:r>
-      <w:proofErr w:type="spellEnd"/>
-      <w:r>
-        <w:rPr>
-          <w:rFonts w:ascii="Times New Roman" w:hAnsi="Times New Roman" w:cs="Times New Roman"/>
-          <w:sz w:val="24"/>
-          <w:szCs w:val="24"/>
-        </w:rPr>
-        <w:t xml:space="preserve"> </w:t>
-      </w:r>
-      <w:proofErr w:type="spellStart"/>
-      <w:r>
-        <w:rPr>
-          <w:rFonts w:ascii="Times New Roman" w:hAnsi="Times New Roman" w:cs="Times New Roman"/>
-          <w:sz w:val="24"/>
-          <w:szCs w:val="24"/>
-        </w:rPr>
-        <w:t>menggunakan</w:t>
-      </w:r>
-      <w:proofErr w:type="spellEnd"/>
-      <w:r>
-        <w:rPr>
-          <w:rFonts w:ascii="Times New Roman" w:hAnsi="Times New Roman" w:cs="Times New Roman"/>
-          <w:sz w:val="24"/>
-          <w:szCs w:val="24"/>
-        </w:rPr>
-        <w:t xml:space="preserve"> SCADA Electrical Power Monitoring System </w:t>
-      </w:r>
-      <w:proofErr w:type="spellStart"/>
-      <w:r>
-        <w:rPr>
-          <w:rFonts w:ascii="Times New Roman" w:hAnsi="Times New Roman" w:cs="Times New Roman"/>
-          <w:sz w:val="24"/>
-          <w:szCs w:val="24"/>
-        </w:rPr>
-        <w:t>Taining</w:t>
-      </w:r>
-      <w:proofErr w:type="spellEnd"/>
-      <w:r>
-        <w:rPr>
-          <w:rFonts w:ascii="Times New Roman" w:hAnsi="Times New Roman" w:cs="Times New Roman"/>
-          <w:sz w:val="24"/>
-          <w:szCs w:val="24"/>
-        </w:rPr>
-        <w:t xml:space="preserve"> Kit </w:t>
-      </w:r>
-      <w:proofErr w:type="spellStart"/>
-      <w:r>
-        <w:rPr>
-          <w:rFonts w:ascii="Times New Roman" w:hAnsi="Times New Roman" w:cs="Times New Roman"/>
-          <w:sz w:val="24"/>
-          <w:szCs w:val="24"/>
-        </w:rPr>
-        <w:t>sebagai</w:t>
-      </w:r>
-      <w:proofErr w:type="spellEnd"/>
-      <w:r>
-        <w:rPr>
-          <w:rFonts w:ascii="Times New Roman" w:hAnsi="Times New Roman" w:cs="Times New Roman"/>
-          <w:sz w:val="24"/>
-          <w:szCs w:val="24"/>
-        </w:rPr>
-        <w:t xml:space="preserve"> </w:t>
-      </w:r>
-      <w:proofErr w:type="spellStart"/>
-      <w:r>
-        <w:rPr>
-          <w:rFonts w:ascii="Times New Roman" w:hAnsi="Times New Roman" w:cs="Times New Roman"/>
-          <w:sz w:val="24"/>
-          <w:szCs w:val="24"/>
-        </w:rPr>
-        <w:t>tempat</w:t>
-      </w:r>
-      <w:proofErr w:type="spellEnd"/>
-      <w:r>
-        <w:rPr>
-          <w:rFonts w:ascii="Times New Roman" w:hAnsi="Times New Roman" w:cs="Times New Roman"/>
-          <w:sz w:val="24"/>
-          <w:szCs w:val="24"/>
-        </w:rPr>
-        <w:t xml:space="preserve"> yang </w:t>
-      </w:r>
-      <w:proofErr w:type="spellStart"/>
-      <w:r>
-        <w:rPr>
-          <w:rFonts w:ascii="Times New Roman" w:hAnsi="Times New Roman" w:cs="Times New Roman"/>
-          <w:sz w:val="24"/>
-          <w:szCs w:val="24"/>
-        </w:rPr>
-        <w:t>digunakan</w:t>
-      </w:r>
-      <w:proofErr w:type="spellEnd"/>
-      <w:r>
-        <w:rPr>
-          <w:rFonts w:ascii="Times New Roman" w:hAnsi="Times New Roman" w:cs="Times New Roman"/>
-          <w:sz w:val="24"/>
-          <w:szCs w:val="24"/>
-        </w:rPr>
-        <w:t xml:space="preserve"> </w:t>
-      </w:r>
-      <w:proofErr w:type="spellStart"/>
-      <w:r>
-        <w:rPr>
-          <w:rFonts w:ascii="Times New Roman" w:hAnsi="Times New Roman" w:cs="Times New Roman"/>
-          <w:sz w:val="24"/>
-          <w:szCs w:val="24"/>
-        </w:rPr>
-        <w:t>untuk</w:t>
-      </w:r>
-      <w:proofErr w:type="spellEnd"/>
-      <w:r>
-        <w:rPr>
-          <w:rFonts w:ascii="Times New Roman" w:hAnsi="Times New Roman" w:cs="Times New Roman"/>
-          <w:sz w:val="24"/>
-          <w:szCs w:val="24"/>
-        </w:rPr>
-        <w:t xml:space="preserve"> </w:t>
-      </w:r>
-      <w:proofErr w:type="spellStart"/>
-      <w:r>
-        <w:rPr>
-          <w:rFonts w:ascii="Times New Roman" w:hAnsi="Times New Roman" w:cs="Times New Roman"/>
-          <w:sz w:val="24"/>
-          <w:szCs w:val="24"/>
-        </w:rPr>
-        <w:t>merangkai</w:t>
-      </w:r>
-      <w:proofErr w:type="spellEnd"/>
-      <w:r>
-        <w:rPr>
-          <w:rFonts w:ascii="Times New Roman" w:hAnsi="Times New Roman" w:cs="Times New Roman"/>
-          <w:sz w:val="24"/>
-          <w:szCs w:val="24"/>
-        </w:rPr>
-        <w:t xml:space="preserve"> </w:t>
-      </w:r>
-      <w:proofErr w:type="spellStart"/>
-      <w:r>
-        <w:rPr>
-          <w:rFonts w:ascii="Times New Roman" w:hAnsi="Times New Roman" w:cs="Times New Roman"/>
-          <w:sz w:val="24"/>
-          <w:szCs w:val="24"/>
-        </w:rPr>
-        <w:lastRenderedPageBreak/>
-        <w:t>kemudian</w:t>
-      </w:r>
-      <w:proofErr w:type="spellEnd"/>
-      <w:r>
-        <w:rPr>
-          <w:rFonts w:ascii="Times New Roman" w:hAnsi="Times New Roman" w:cs="Times New Roman"/>
-          <w:sz w:val="24"/>
-          <w:szCs w:val="24"/>
-        </w:rPr>
-        <w:t xml:space="preserve"> </w:t>
-      </w:r>
-      <w:proofErr w:type="spellStart"/>
-      <w:r>
-        <w:rPr>
-          <w:rFonts w:ascii="Times New Roman" w:hAnsi="Times New Roman" w:cs="Times New Roman"/>
-          <w:sz w:val="24"/>
-          <w:szCs w:val="24"/>
-        </w:rPr>
-        <w:t>ada</w:t>
-      </w:r>
-      <w:proofErr w:type="spellEnd"/>
-      <w:r>
-        <w:rPr>
-          <w:rFonts w:ascii="Times New Roman" w:hAnsi="Times New Roman" w:cs="Times New Roman"/>
-          <w:sz w:val="24"/>
-          <w:szCs w:val="24"/>
-        </w:rPr>
-        <w:t xml:space="preserve"> </w:t>
-      </w:r>
-      <w:proofErr w:type="spellStart"/>
-      <w:r>
-        <w:rPr>
-          <w:rFonts w:ascii="Times New Roman" w:hAnsi="Times New Roman" w:cs="Times New Roman"/>
-          <w:sz w:val="24"/>
-          <w:szCs w:val="24"/>
-        </w:rPr>
-        <w:t>kabel</w:t>
-      </w:r>
-      <w:proofErr w:type="spellEnd"/>
-      <w:r>
-        <w:rPr>
-          <w:rFonts w:ascii="Times New Roman" w:hAnsi="Times New Roman" w:cs="Times New Roman"/>
-          <w:sz w:val="24"/>
-          <w:szCs w:val="24"/>
-        </w:rPr>
-        <w:t xml:space="preserve"> banana, </w:t>
-      </w:r>
-      <w:proofErr w:type="spellStart"/>
-      <w:r>
-        <w:rPr>
-          <w:rFonts w:ascii="Times New Roman" w:hAnsi="Times New Roman" w:cs="Times New Roman"/>
-          <w:sz w:val="24"/>
-          <w:szCs w:val="24"/>
-        </w:rPr>
-        <w:t>kita</w:t>
-      </w:r>
-      <w:proofErr w:type="spellEnd"/>
-      <w:r>
-        <w:rPr>
-          <w:rFonts w:ascii="Times New Roman" w:hAnsi="Times New Roman" w:cs="Times New Roman"/>
-          <w:sz w:val="24"/>
-          <w:szCs w:val="24"/>
-        </w:rPr>
-        <w:t xml:space="preserve"> </w:t>
-      </w:r>
-      <w:proofErr w:type="spellStart"/>
-      <w:r>
-        <w:rPr>
-          <w:rFonts w:ascii="Times New Roman" w:hAnsi="Times New Roman" w:cs="Times New Roman"/>
-          <w:sz w:val="24"/>
-          <w:szCs w:val="24"/>
-        </w:rPr>
-        <w:t>disini</w:t>
-      </w:r>
-      <w:proofErr w:type="spellEnd"/>
-      <w:r>
-        <w:rPr>
-          <w:rFonts w:ascii="Times New Roman" w:hAnsi="Times New Roman" w:cs="Times New Roman"/>
-          <w:sz w:val="24"/>
-          <w:szCs w:val="24"/>
-        </w:rPr>
-        <w:t xml:space="preserve"> </w:t>
-      </w:r>
-      <w:proofErr w:type="spellStart"/>
-      <w:r>
-        <w:rPr>
-          <w:rFonts w:ascii="Times New Roman" w:hAnsi="Times New Roman" w:cs="Times New Roman"/>
-          <w:sz w:val="24"/>
-          <w:szCs w:val="24"/>
-        </w:rPr>
-        <w:t>menggunakan</w:t>
-      </w:r>
-      <w:proofErr w:type="spellEnd"/>
-      <w:r>
-        <w:rPr>
-          <w:rFonts w:ascii="Times New Roman" w:hAnsi="Times New Roman" w:cs="Times New Roman"/>
-          <w:sz w:val="24"/>
-          <w:szCs w:val="24"/>
-        </w:rPr>
-        <w:t xml:space="preserve"> </w:t>
-      </w:r>
-      <w:proofErr w:type="spellStart"/>
-      <w:r>
-        <w:rPr>
-          <w:rFonts w:ascii="Times New Roman" w:hAnsi="Times New Roman" w:cs="Times New Roman"/>
-          <w:sz w:val="24"/>
-          <w:szCs w:val="24"/>
-        </w:rPr>
-        <w:t>mesin</w:t>
-      </w:r>
-      <w:proofErr w:type="spellEnd"/>
-      <w:r>
-        <w:rPr>
-          <w:rFonts w:ascii="Times New Roman" w:hAnsi="Times New Roman" w:cs="Times New Roman"/>
-          <w:sz w:val="24"/>
-          <w:szCs w:val="24"/>
-        </w:rPr>
-        <w:t xml:space="preserve"> </w:t>
-      </w:r>
-      <w:proofErr w:type="spellStart"/>
-      <w:r>
-        <w:rPr>
-          <w:rFonts w:ascii="Times New Roman" w:hAnsi="Times New Roman" w:cs="Times New Roman"/>
-          <w:sz w:val="24"/>
-          <w:szCs w:val="24"/>
-        </w:rPr>
-        <w:t>induksi</w:t>
-      </w:r>
-      <w:proofErr w:type="spellEnd"/>
-      <w:r>
-        <w:rPr>
-          <w:rFonts w:ascii="Times New Roman" w:hAnsi="Times New Roman" w:cs="Times New Roman"/>
-          <w:sz w:val="24"/>
-          <w:szCs w:val="24"/>
-        </w:rPr>
-        <w:t xml:space="preserve"> 3 </w:t>
-      </w:r>
-      <w:proofErr w:type="spellStart"/>
-      <w:r>
-        <w:rPr>
-          <w:rFonts w:ascii="Times New Roman" w:hAnsi="Times New Roman" w:cs="Times New Roman"/>
-          <w:sz w:val="24"/>
-          <w:szCs w:val="24"/>
-        </w:rPr>
-        <w:t>fasa</w:t>
-      </w:r>
-      <w:proofErr w:type="spellEnd"/>
-      <w:r>
-        <w:rPr>
-          <w:rFonts w:ascii="Times New Roman" w:hAnsi="Times New Roman" w:cs="Times New Roman"/>
-          <w:sz w:val="24"/>
-          <w:szCs w:val="24"/>
-        </w:rPr>
-        <w:t xml:space="preserve"> </w:t>
-      </w:r>
-      <w:proofErr w:type="spellStart"/>
-      <w:r>
-        <w:rPr>
-          <w:rFonts w:ascii="Times New Roman" w:hAnsi="Times New Roman" w:cs="Times New Roman"/>
-          <w:sz w:val="24"/>
-          <w:szCs w:val="24"/>
-        </w:rPr>
-        <w:t>untuk</w:t>
-      </w:r>
-      <w:proofErr w:type="spellEnd"/>
-      <w:r>
-        <w:rPr>
-          <w:rFonts w:ascii="Times New Roman" w:hAnsi="Times New Roman" w:cs="Times New Roman"/>
-          <w:sz w:val="24"/>
-          <w:szCs w:val="24"/>
-        </w:rPr>
-        <w:t xml:space="preserve"> </w:t>
-      </w:r>
-      <w:proofErr w:type="spellStart"/>
-      <w:r>
-        <w:rPr>
-          <w:rFonts w:ascii="Times New Roman" w:hAnsi="Times New Roman" w:cs="Times New Roman"/>
-          <w:sz w:val="24"/>
-          <w:szCs w:val="24"/>
-        </w:rPr>
-        <w:t>melihat</w:t>
-      </w:r>
-      <w:proofErr w:type="spellEnd"/>
-      <w:r>
-        <w:rPr>
-          <w:rFonts w:ascii="Times New Roman" w:hAnsi="Times New Roman" w:cs="Times New Roman"/>
-          <w:sz w:val="24"/>
-          <w:szCs w:val="24"/>
-        </w:rPr>
-        <w:t xml:space="preserve"> </w:t>
-      </w:r>
-      <w:proofErr w:type="spellStart"/>
-      <w:r>
-        <w:rPr>
-          <w:rFonts w:ascii="Times New Roman" w:hAnsi="Times New Roman" w:cs="Times New Roman"/>
-          <w:sz w:val="24"/>
-          <w:szCs w:val="24"/>
-        </w:rPr>
-        <w:t>perubahan</w:t>
-      </w:r>
-      <w:proofErr w:type="spellEnd"/>
-      <w:r>
-        <w:rPr>
-          <w:rFonts w:ascii="Times New Roman" w:hAnsi="Times New Roman" w:cs="Times New Roman"/>
-          <w:sz w:val="24"/>
-          <w:szCs w:val="24"/>
-        </w:rPr>
-        <w:t xml:space="preserve"> </w:t>
-      </w:r>
-      <w:proofErr w:type="spellStart"/>
-      <w:r>
-        <w:rPr>
-          <w:rFonts w:ascii="Times New Roman" w:hAnsi="Times New Roman" w:cs="Times New Roman"/>
-          <w:sz w:val="24"/>
-          <w:szCs w:val="24"/>
-        </w:rPr>
-        <w:t>putaran</w:t>
-      </w:r>
-      <w:proofErr w:type="spellEnd"/>
-      <w:r>
-        <w:rPr>
-          <w:rFonts w:ascii="Times New Roman" w:hAnsi="Times New Roman" w:cs="Times New Roman"/>
-          <w:sz w:val="24"/>
-          <w:szCs w:val="24"/>
-        </w:rPr>
-        <w:t xml:space="preserve"> pada </w:t>
-      </w:r>
-      <w:proofErr w:type="spellStart"/>
-      <w:proofErr w:type="gramStart"/>
-      <w:r>
-        <w:rPr>
-          <w:rFonts w:ascii="Times New Roman" w:hAnsi="Times New Roman" w:cs="Times New Roman"/>
-          <w:sz w:val="24"/>
-          <w:szCs w:val="24"/>
-        </w:rPr>
-        <w:t>frekuensinya</w:t>
-      </w:r>
-      <w:proofErr w:type="spellEnd"/>
-      <w:r>
-        <w:rPr>
-          <w:rFonts w:ascii="Times New Roman" w:hAnsi="Times New Roman" w:cs="Times New Roman"/>
-          <w:sz w:val="24"/>
-          <w:szCs w:val="24"/>
-        </w:rPr>
-        <w:t xml:space="preserve">,  </w:t>
-      </w:r>
-      <w:proofErr w:type="spellStart"/>
-      <w:r>
-        <w:rPr>
-          <w:rFonts w:ascii="Times New Roman" w:hAnsi="Times New Roman" w:cs="Times New Roman"/>
-          <w:sz w:val="24"/>
-          <w:szCs w:val="24"/>
-        </w:rPr>
-        <w:t>kemudian</w:t>
-      </w:r>
-      <w:proofErr w:type="spellEnd"/>
-      <w:proofErr w:type="gramEnd"/>
-      <w:r>
-        <w:rPr>
-          <w:rFonts w:ascii="Times New Roman" w:hAnsi="Times New Roman" w:cs="Times New Roman"/>
-          <w:sz w:val="24"/>
-          <w:szCs w:val="24"/>
-        </w:rPr>
-        <w:t xml:space="preserve"> </w:t>
-      </w:r>
-      <w:proofErr w:type="spellStart"/>
-      <w:r>
-        <w:rPr>
-          <w:rFonts w:ascii="Times New Roman" w:hAnsi="Times New Roman" w:cs="Times New Roman"/>
-          <w:sz w:val="24"/>
-          <w:szCs w:val="24"/>
-        </w:rPr>
-        <w:t>kita</w:t>
-      </w:r>
-      <w:proofErr w:type="spellEnd"/>
-      <w:r>
-        <w:rPr>
-          <w:rFonts w:ascii="Times New Roman" w:hAnsi="Times New Roman" w:cs="Times New Roman"/>
-          <w:sz w:val="24"/>
-          <w:szCs w:val="24"/>
-        </w:rPr>
-        <w:t xml:space="preserve"> juga </w:t>
-      </w:r>
-      <w:proofErr w:type="spellStart"/>
-      <w:r>
-        <w:rPr>
-          <w:rFonts w:ascii="Times New Roman" w:hAnsi="Times New Roman" w:cs="Times New Roman"/>
-          <w:sz w:val="24"/>
-          <w:szCs w:val="24"/>
-        </w:rPr>
-        <w:t>menggunakan</w:t>
-      </w:r>
-      <w:proofErr w:type="spellEnd"/>
-      <w:r>
-        <w:rPr>
-          <w:rFonts w:ascii="Times New Roman" w:hAnsi="Times New Roman" w:cs="Times New Roman"/>
-          <w:sz w:val="24"/>
-          <w:szCs w:val="24"/>
-        </w:rPr>
-        <w:t xml:space="preserve"> </w:t>
-      </w:r>
-      <w:proofErr w:type="spellStart"/>
-      <w:r>
-        <w:rPr>
-          <w:rFonts w:ascii="Times New Roman" w:hAnsi="Times New Roman" w:cs="Times New Roman"/>
-          <w:sz w:val="24"/>
-          <w:szCs w:val="24"/>
-        </w:rPr>
-        <w:t>kabel</w:t>
-      </w:r>
-      <w:proofErr w:type="spellEnd"/>
-      <w:r>
-        <w:rPr>
-          <w:rFonts w:ascii="Times New Roman" w:hAnsi="Times New Roman" w:cs="Times New Roman"/>
-          <w:sz w:val="24"/>
-          <w:szCs w:val="24"/>
-        </w:rPr>
-        <w:t xml:space="preserve"> ethernet dan juga </w:t>
-      </w:r>
-      <w:proofErr w:type="spellStart"/>
-      <w:r>
-        <w:rPr>
-          <w:rFonts w:ascii="Times New Roman" w:hAnsi="Times New Roman" w:cs="Times New Roman"/>
-          <w:sz w:val="24"/>
-          <w:szCs w:val="24"/>
-        </w:rPr>
-        <w:t>kabel</w:t>
-      </w:r>
-      <w:proofErr w:type="spellEnd"/>
-      <w:r>
-        <w:rPr>
-          <w:rFonts w:ascii="Times New Roman" w:hAnsi="Times New Roman" w:cs="Times New Roman"/>
-          <w:sz w:val="24"/>
-          <w:szCs w:val="24"/>
-        </w:rPr>
-        <w:t xml:space="preserve"> HDMI.</w:t>
-      </w:r>
-    </w:p>
-    <w:p>
-      <w:pPr>
-        <w:pStyle w:val="ListParagraph"/>
-        <w:numPr>
-          <w:ilvl w:val="0"/>
-          <w:numId w:val="20"/>
-        </w:numPr>
-        <w:tabs>
-          <w:tab w:val="left" w:pos="1298"/>
-        </w:tabs>
-        <w:spacing w:after="240" w:line="360" w:lineRule="auto"/>
-        <w:jc w:val="both"/>
-        <w:rPr>
-          <w:b/>
-          <w:bCs/>
-          <w:sz w:val="24"/>
-          <w:szCs w:val="24"/>
-        </w:rPr>
-      </w:pPr>
-      <w:r>
-        <w:rPr>
-          <w:b/>
-          <w:bCs/>
-          <w:sz w:val="24"/>
-          <w:szCs w:val="24"/>
-        </w:rPr>
         <w:t>Kesimpulan</w:t>
       </w:r>
     </w:p>
@@ -7844,6 +7124,7 @@
           <w:sz w:val="24"/>
           <w:szCs w:val="24"/>
         </w:rPr>
+        <w:lastRenderedPageBreak/>
         <w:t>mengontrol</w:t>
       </w:r>
       <w:proofErr w:type="spellEnd"/>
@@ -8150,7 +7431,6 @@
         <w:t xml:space="preserve">[2] </w:t>
       </w:r>
       <w:proofErr w:type="spellStart"/>
-      <w:proofErr w:type="gramStart"/>
       <w:r>
         <w:rPr>
           <w:rFonts w:ascii="Times New Roman" w:hAnsi="Times New Roman" w:cs="Times New Roman"/>
@@ -8162,14 +7442,7 @@
         <w:rPr>
           <w:rFonts w:ascii="Times New Roman" w:hAnsi="Times New Roman" w:cs="Times New Roman"/>
         </w:rPr>
-        <w:t xml:space="preserve"> .</w:t>
-      </w:r>
-      <w:proofErr w:type="gramEnd"/>
-      <w:r>
-        <w:rPr>
-          <w:rFonts w:ascii="Times New Roman" w:hAnsi="Times New Roman" w:cs="Times New Roman"/>
-        </w:rPr>
-        <w:t xml:space="preserve">, Rudie S. </w:t>
+        <w:t xml:space="preserve"> ., Rudie S. </w:t>
       </w:r>
       <w:proofErr w:type="spellStart"/>
       <w:r>
@@ -8409,14 +7682,7 @@
         <w:rPr>
           <w:rFonts w:ascii="Times New Roman" w:hAnsi="Times New Roman" w:cs="Times New Roman"/>
         </w:rPr>
-        <w:t>, 2004</w:t>
-      </w:r>
-      <w:proofErr w:type="gramStart"/>
-      <w:r>
-        <w:rPr>
-          <w:rFonts w:ascii="Times New Roman" w:hAnsi="Times New Roman" w:cs="Times New Roman"/>
-        </w:rPr>
-        <w:t>, ”</w:t>
+        <w:t>, 2004, ”</w:t>
       </w:r>
       <w:proofErr w:type="spellStart"/>
       <w:r>
@@ -8426,7 +7692,6 @@
         <w:t>Pengaturan</w:t>
       </w:r>
       <w:proofErr w:type="spellEnd"/>
-      <w:proofErr w:type="gramEnd"/>
       <w:r>
         <w:rPr>
           <w:rFonts w:ascii="Times New Roman" w:hAnsi="Times New Roman" w:cs="Times New Roman"/>
@@ -9023,7 +8288,6 @@
         <w:szCs w:val="32"/>
       </w:rPr>
     </w:pPr>
-    <w:proofErr w:type="gramStart"/>
     <w:r>
       <w:rPr>
         <w:color w:val="0070C0"/>
@@ -9046,16 +8310,7 @@
         <w:sz w:val="24"/>
         <w:szCs w:val="24"/>
       </w:rPr>
-      <w:t>LABORATORIUM</w:t>
-    </w:r>
-    <w:proofErr w:type="gramEnd"/>
-    <w:r>
-      <w:rPr>
-        <w:color w:val="0070C0"/>
-        <w:sz w:val="24"/>
-        <w:szCs w:val="24"/>
-      </w:rPr>
-      <w:t xml:space="preserve"> SISTEM KONTROL</w:t>
+      <w:t>LABORATORIUM SISTEM KONTROL</w:t>
     </w:r>
     <w:r>
       <w:rPr>
@@ -12631,25 +11886,6 @@
 </file>
 
 <file path=customXml/item2.xml><?xml version="1.0" encoding="utf-8"?>
-<b:Sources xmlns:b="http://schemas.openxmlformats.org/officeDocument/2006/bibliography" xmlns="http://schemas.openxmlformats.org/officeDocument/2006/bibliography" SelectedStyle="\APASixthEditionOfficeOnline.xsl" StyleName="APA" Version="6"/>
-</file>
-
-<file path=customXml/item3.xml><?xml version="1.0" encoding="utf-8"?>
-<p:properties xmlns:p="http://schemas.microsoft.com/office/2006/metadata/properties" xmlns:xsi="http://www.w3.org/2001/XMLSchema-instance" xmlns:pc="http://schemas.microsoft.com/office/infopath/2007/PartnerControls">
-  <documentManagement/>
-</p:properties>
-</file>
-
-<file path=customXml/item4.xml><?xml version="1.0" encoding="utf-8"?>
-<?mso-contentType ?>
-<FormTemplates xmlns="http://schemas.microsoft.com/sharepoint/v3/contenttype/forms">
-  <Display>DocumentLibraryForm</Display>
-  <Edit>DocumentLibraryForm</Edit>
-  <New>DocumentLibraryForm</New>
-</FormTemplates>
-</file>
-
-<file path=customXml/item5.xml><?xml version="1.0" encoding="utf-8"?>
 <ct:contentTypeSchema xmlns:ct="http://schemas.microsoft.com/office/2006/metadata/contentType" xmlns:ma="http://schemas.microsoft.com/office/2006/metadata/properties/metaAttributes" ct:_="" ma:_="" ma:contentTypeName="Document" ma:contentTypeID="0x0101006BAAD59793BBDD49B4B97B3F9A3774A9" ma:contentTypeVersion="9" ma:contentTypeDescription="Create a new document." ma:contentTypeScope="" ma:versionID="3567c1d1afcf8774bfd7101dc4ff7246">
   <xsd:schema xmlns:xsd="http://www.w3.org/2001/XMLSchema" xmlns:xs="http://www.w3.org/2001/XMLSchema" xmlns:p="http://schemas.microsoft.com/office/2006/metadata/properties" xmlns:ns3="ded59f24-0498-4b5d-a873-da4b773febe1" xmlns:ns4="a1a3b75c-85ca-4dc7-83b1-171040009681" targetNamespace="http://schemas.microsoft.com/office/2006/metadata/properties" ma:root="true" ma:fieldsID="89b611d2cf5080035c4d7b0501abea2e" ns3:_="" ns4:_="">
     <xsd:import namespace="ded59f24-0498-4b5d-a873-da4b773febe1"/>
@@ -12846,6 +12082,25 @@
 </ct:contentTypeSchema>
 </file>
 
+<file path=customXml/item3.xml><?xml version="1.0" encoding="utf-8"?>
+<?mso-contentType ?>
+<FormTemplates xmlns="http://schemas.microsoft.com/sharepoint/v3/contenttype/forms">
+  <Display>DocumentLibraryForm</Display>
+  <Edit>DocumentLibraryForm</Edit>
+  <New>DocumentLibraryForm</New>
+</FormTemplates>
+</file>
+
+<file path=customXml/item4.xml><?xml version="1.0" encoding="utf-8"?>
+<p:properties xmlns:p="http://schemas.microsoft.com/office/2006/metadata/properties" xmlns:xsi="http://www.w3.org/2001/XMLSchema-instance" xmlns:pc="http://schemas.microsoft.com/office/infopath/2007/PartnerControls">
+  <documentManagement/>
+</p:properties>
+</file>
+
+<file path=customXml/item5.xml><?xml version="1.0" encoding="utf-8"?>
+<b:Sources xmlns:b="http://schemas.openxmlformats.org/officeDocument/2006/bibliography" xmlns="http://schemas.openxmlformats.org/officeDocument/2006/bibliography" SelectedStyle="\APASixthEditionOfficeOnline.xsl" StyleName="APA" Version="6"/>
+</file>
+
 <file path=customXml/itemProps1.xml><?xml version="1.0" encoding="utf-8"?>
 <ds:datastoreItem xmlns:ds="http://schemas.openxmlformats.org/officeDocument/2006/customXml" ds:itemID="{55AF091B-3C7A-41E3-B477-F2FDAA23CFDA}">
   <ds:schemaRefs>
@@ -12855,31 +12110,6 @@
 </file>
 
 <file path=customXml/itemProps2.xml><?xml version="1.0" encoding="utf-8"?>
-<ds:datastoreItem xmlns:ds="http://schemas.openxmlformats.org/officeDocument/2006/customXml" ds:itemID="{71FDE272-9961-44DD-A2AF-2B1EB7587545}">
-  <ds:schemaRefs>
-    <ds:schemaRef ds:uri="http://schemas.openxmlformats.org/officeDocument/2006/bibliography"/>
-  </ds:schemaRefs>
-</ds:datastoreItem>
-</file>
-
-<file path=customXml/itemProps3.xml><?xml version="1.0" encoding="utf-8"?>
-<ds:datastoreItem xmlns:ds="http://schemas.openxmlformats.org/officeDocument/2006/customXml" ds:itemID="{7A171EDB-78FC-4C12-AEB6-C960B668BE57}">
-  <ds:schemaRefs>
-    <ds:schemaRef ds:uri="http://schemas.microsoft.com/office/2006/metadata/properties"/>
-    <ds:schemaRef ds:uri="http://schemas.microsoft.com/office/infopath/2007/PartnerControls"/>
-  </ds:schemaRefs>
-</ds:datastoreItem>
-</file>
-
-<file path=customXml/itemProps4.xml><?xml version="1.0" encoding="utf-8"?>
-<ds:datastoreItem xmlns:ds="http://schemas.openxmlformats.org/officeDocument/2006/customXml" ds:itemID="{E2A77FDB-3317-4227-8A23-8F6070AB41CF}">
-  <ds:schemaRefs>
-    <ds:schemaRef ds:uri="http://schemas.microsoft.com/sharepoint/v3/contenttype/forms"/>
-  </ds:schemaRefs>
-</ds:datastoreItem>
-</file>
-
-<file path=customXml/itemProps5.xml><?xml version="1.0" encoding="utf-8"?>
 <ds:datastoreItem xmlns:ds="http://schemas.openxmlformats.org/officeDocument/2006/customXml" ds:itemID="{BCDC32BB-84C0-4F7E-9B92-7E0D20CC192C}">
   <ds:schemaRefs>
     <ds:schemaRef ds:uri="http://schemas.microsoft.com/office/2006/metadata/contentType"/>
@@ -12896,4 +12126,29 @@
     <ds:schemaRef ds:uri="http://schemas.microsoft.com/internal/obd"/>
   </ds:schemaRefs>
 </ds:datastoreItem>
+</file>
+
+<file path=customXml/itemProps3.xml><?xml version="1.0" encoding="utf-8"?>
+<ds:datastoreItem xmlns:ds="http://schemas.openxmlformats.org/officeDocument/2006/customXml" ds:itemID="{E2A77FDB-3317-4227-8A23-8F6070AB41CF}">
+  <ds:schemaRefs>
+    <ds:schemaRef ds:uri="http://schemas.microsoft.com/sharepoint/v3/contenttype/forms"/>
+  </ds:schemaRefs>
+</ds:datastoreItem>
+</file>
+
+<file path=customXml/itemProps4.xml><?xml version="1.0" encoding="utf-8"?>
+<ds:datastoreItem xmlns:ds="http://schemas.openxmlformats.org/officeDocument/2006/customXml" ds:itemID="{7A171EDB-78FC-4C12-AEB6-C960B668BE57}">
+  <ds:schemaRefs>
+    <ds:schemaRef ds:uri="http://schemas.microsoft.com/office/2006/metadata/properties"/>
+    <ds:schemaRef ds:uri="http://schemas.microsoft.com/office/infopath/2007/PartnerControls"/>
+  </ds:schemaRefs>
+</ds:datastoreItem>
+</file>
+
+<file path=customXml/itemProps5.xml><?xml version="1.0" encoding="utf-8"?>
+<ds:datastoreItem xmlns:ds="http://schemas.openxmlformats.org/officeDocument/2006/customXml" ds:itemID="{71FDE272-9961-44DD-A2AF-2B1EB7587545}">
+  <ds:schemaRefs>
+    <ds:schemaRef ds:uri="http://schemas.openxmlformats.org/officeDocument/2006/bibliography"/>
+  </ds:schemaRefs>
+</ds:datastoreItem>
 </file>
</xml_diff>